<commit_message>
Pinecrest agent: answer the duration as the One Hour Vacation
A drip takes about an hour, which is the brand line, so the answer uses it
rather than stating a bare number: "About an hour — we call it your One Hour
Vacation®." Section 2 now has no content gaps; the only [NEEDED] marker left
is the location email for rule 3e.

Co-Authored-By: Claude Opus 5 <noreply@anthropic.com>
Claude-Session: https://claude.ai/code/session_01KKJmBoJpTKuNCDtvwCeo7z
</commit_message>
<xml_diff>
--- a/docs/Prime_IV_Pinecrest_SMS_AI_Agent_Prompt_and_Knowledge_Base.docx
+++ b/docs/Prime_IV_Pinecrest_SMS_AI_Agent_Prompt_and_Knowledge_Base.docx
@@ -3483,12 +3483,12 @@
           <w:sz w:val="20"/>
           <w:szCs w:val="20"/>
         </w:rPr>
-        <w:t xml:space="preserve">Q:  How long does a drip take?</w:t>
-      </w:r>
-    </w:p>
-    <w:p>
-      <w:pPr>
-        <w:spacing w:after="60" w:line="260"/>
+        <w:t xml:space="preserve">Q:  How long does a drip take? / How much time should I set aside?</w:t>
+      </w:r>
+    </w:p>
+    <w:p>
+      <w:pPr>
+        <w:spacing w:after="0" w:line="260"/>
         <w:ind w:left="280"/>
       </w:pPr>
       <w:r>
@@ -3500,7 +3500,24 @@
           <w:sz w:val="20"/>
           <w:szCs w:val="20"/>
         </w:rPr>
-        <w:t xml:space="preserve">A:  [NEEDED — the menu carries no durations. One number for a standard drip is enough.]</w:t>
+        <w:t xml:space="preserve">A:  About an hour — we call it your One Hour Vacation®. Zero-gravity chair, a blanket, and the hour is yours. Want me to find you a time?</w:t>
+      </w:r>
+    </w:p>
+    <w:p>
+      <w:pPr>
+        <w:spacing w:after="60" w:line="260"/>
+        <w:ind w:left="280"/>
+      </w:pPr>
+      <w:r>
+        <w:rPr>
+          <w:rFonts w:ascii="Calibri" w:cs="Calibri" w:eastAsia="Calibri" w:hAnsi="Calibri"/>
+          <w:i w:val="false"/>
+          <w:iCs w:val="false"/>
+          <w:color w:val="000000"/>
+          <w:sz w:val="20"/>
+          <w:szCs w:val="20"/>
+        </w:rPr>
+        <w:t xml:space="preserve">     -Prime IV Pinecrest</w:t>
       </w:r>
     </w:p>
     <w:p>
@@ -9175,95 +9192,6 @@
                 <w:szCs w:val="19"/>
               </w:rPr>
               <w:t xml:space="preserve">Blocks</w:t>
-            </w:r>
-          </w:p>
-        </w:tc>
-      </w:tr>
-      <w:tr>
-        <w:trPr>
-          <w:tblHeader w:val="false"/>
-        </w:trPr>
-        <w:tc>
-          <w:tcPr>
-            <w:tcW w:type="dxa" w:w="4400"/>
-            <w:shd w:fill="FFFFFF" w:color="auto" w:val="clear"/>
-            <w:tcMar>
-              <w:top w:type="dxa" w:w="90"/>
-              <w:left w:type="dxa" w:w="120"/>
-              <w:bottom w:type="dxa" w:w="90"/>
-              <w:right w:type="dxa" w:w="120"/>
-            </w:tcMar>
-          </w:tcPr>
-          <w:p>
-            <w:pPr>
-              <w:spacing w:after="0" w:line="250"/>
-            </w:pPr>
-            <w:r>
-              <w:rPr>
-                <w:rFonts w:ascii="Calibri" w:cs="Calibri" w:eastAsia="Calibri" w:hAnsi="Calibri"/>
-                <w:b w:val="false"/>
-                <w:bCs w:val="false"/>
-                <w:color w:val="000000"/>
-                <w:sz w:val="19"/>
-                <w:szCs w:val="19"/>
-              </w:rPr>
-              <w:t xml:space="preserve">How long a standard drip takes</w:t>
-            </w:r>
-          </w:p>
-        </w:tc>
-        <w:tc>
-          <w:tcPr>
-            <w:tcW w:type="dxa" w:w="1900"/>
-            <w:shd w:fill="FFFFFF" w:color="auto" w:val="clear"/>
-            <w:tcMar>
-              <w:top w:type="dxa" w:w="90"/>
-              <w:left w:type="dxa" w:w="120"/>
-              <w:bottom w:type="dxa" w:w="90"/>
-              <w:right w:type="dxa" w:w="120"/>
-            </w:tcMar>
-          </w:tcPr>
-          <w:p>
-            <w:pPr>
-              <w:spacing w:after="0" w:line="250"/>
-            </w:pPr>
-            <w:r>
-              <w:rPr>
-                <w:rFonts w:ascii="Calibri" w:cs="Calibri" w:eastAsia="Calibri" w:hAnsi="Calibri"/>
-                <w:b w:val="false"/>
-                <w:bCs w:val="false"/>
-                <w:color w:val="000000"/>
-                <w:sz w:val="19"/>
-                <w:szCs w:val="19"/>
-              </w:rPr>
-              <w:t xml:space="preserve">Spa team</w:t>
-            </w:r>
-          </w:p>
-        </w:tc>
-        <w:tc>
-          <w:tcPr>
-            <w:tcW w:type="dxa" w:w="3000"/>
-            <w:shd w:fill="FFFFFF" w:color="auto" w:val="clear"/>
-            <w:tcMar>
-              <w:top w:type="dxa" w:w="90"/>
-              <w:left w:type="dxa" w:w="120"/>
-              <w:bottom w:type="dxa" w:w="90"/>
-              <w:right w:type="dxa" w:w="120"/>
-            </w:tcMar>
-          </w:tcPr>
-          <w:p>
-            <w:pPr>
-              <w:spacing w:after="0" w:line="250"/>
-            </w:pPr>
-            <w:r>
-              <w:rPr>
-                <w:rFonts w:ascii="Calibri" w:cs="Calibri" w:eastAsia="Calibri" w:hAnsi="Calibri"/>
-                <w:b w:val="false"/>
-                <w:bCs w:val="false"/>
-                <w:color w:val="000000"/>
-                <w:sz w:val="19"/>
-                <w:szCs w:val="19"/>
-              </w:rPr>
-              <w:t xml:space="preserve">“How long does it take”</w:t>
             </w:r>
           </w:p>
         </w:tc>

</xml_diff>

<commit_message>
Clear unused OAuth registrations, and give the Pinecrest agent somewhere to get its times (#26)
The Pinecrest prompt told the agent to offer two specific times without
saying where to get them, which asks a model with no calendar in front of
it to produce something plausible. It may now only offer times it has
been handed, and collects a preferred day when it has none. New rule 3c
has the workflow read free slots from the calendar the tag routing picked
and pass them in, the same shape the portal's own CRM engine uses.

Separately: dynamic client registration is open, so oauth_clients
collects rows from abandoned attempts with no way to see or clear them.
The settings page now lists registrations that never connected and can
remove one. A client holding a live token is excluded from the list and
refused by the delete, so a working connection cannot be cut off this
way; that still goes through the connection revoke, which leaves the
trail intact.
</commit_message>
<xml_diff>
--- a/docs/Prime_IV_Pinecrest_SMS_AI_Agent_Prompt_and_Knowledge_Base.docx
+++ b/docs/Prime_IV_Pinecrest_SMS_AI_Agent_Prompt_and_Knowledge_Base.docx
@@ -2279,7 +2279,7 @@
           <w:sz w:val="17"/>
           <w:szCs w:val="17"/>
         </w:rPr>
-        <w:t xml:space="preserve">Offer two specific times, never a list of options. Prefer a slot where both</w:t>
+        <w:t xml:space="preserve">Offer two specific times, never a list of options, and only times you have been</w:t>
       </w:r>
     </w:p>
     <w:p>
@@ -2294,7 +2294,7 @@
           <w:sz w:val="17"/>
           <w:szCs w:val="17"/>
         </w:rPr>
-        <w:t xml:space="preserve">chairs are free. For a first-time client, offer times before 3:30 PM. If a</w:t>
+        <w:t xml:space="preserve">given as free. For a first-time client, offer times before 3:30 PM. If a client</w:t>
       </w:r>
     </w:p>
     <w:p>
@@ -2309,7 +2309,82 @@
           <w:sz w:val="17"/>
           <w:szCs w:val="17"/>
         </w:rPr>
-        <w:t xml:space="preserve">client names a day or time, repeat it back and ask them to confirm.</w:t>
+        <w:t xml:space="preserve">names a day or time, repeat it back and ask them to confirm.</w:t>
+      </w:r>
+    </w:p>
+    <w:p>
+      <w:pPr>
+        <w:shd w:fill="F2F5F8" w:color="auto" w:val="clear"/>
+        <w:spacing w:after="0" w:line="230"/>
+        <w:ind w:left="170" w:right="170"/>
+      </w:pPr>
+      <w:r>
+        <w:rPr>
+          <w:rFonts w:ascii="Consolas" w:cs="Consolas" w:eastAsia="Consolas" w:hAnsi="Consolas"/>
+          <w:sz w:val="17"/>
+          <w:szCs w:val="17"/>
+        </w:rPr>
+        <w:t xml:space="preserve"> </w:t>
+      </w:r>
+    </w:p>
+    <w:p>
+      <w:pPr>
+        <w:shd w:fill="F2F5F8" w:color="auto" w:val="clear"/>
+        <w:spacing w:after="0" w:line="230"/>
+        <w:ind w:left="170" w:right="170"/>
+      </w:pPr>
+      <w:r>
+        <w:rPr>
+          <w:rFonts w:ascii="Consolas" w:cs="Consolas" w:eastAsia="Consolas" w:hAnsi="Consolas"/>
+          <w:sz w:val="17"/>
+          <w:szCs w:val="17"/>
+        </w:rPr>
+        <w:t xml:space="preserve">If no live availability has been loaded, do not propose or confirm a time at</w:t>
+      </w:r>
+    </w:p>
+    <w:p>
+      <w:pPr>
+        <w:shd w:fill="F2F5F8" w:color="auto" w:val="clear"/>
+        <w:spacing w:after="0" w:line="230"/>
+        <w:ind w:left="170" w:right="170"/>
+      </w:pPr>
+      <w:r>
+        <w:rPr>
+          <w:rFonts w:ascii="Consolas" w:cs="Consolas" w:eastAsia="Consolas" w:hAnsi="Consolas"/>
+          <w:sz w:val="17"/>
+          <w:szCs w:val="17"/>
+        </w:rPr>
+        <w:t xml:space="preserve">all. Ask which day and rough time suits them, say the team will confirm, and</w:t>
+      </w:r>
+    </w:p>
+    <w:p>
+      <w:pPr>
+        <w:shd w:fill="F2F5F8" w:color="auto" w:val="clear"/>
+        <w:spacing w:after="0" w:line="230"/>
+        <w:ind w:left="170" w:right="170"/>
+      </w:pPr>
+      <w:r>
+        <w:rPr>
+          <w:rFonts w:ascii="Consolas" w:cs="Consolas" w:eastAsia="Consolas" w:hAnsi="Consolas"/>
+          <w:sz w:val="17"/>
+          <w:szCs w:val="17"/>
+        </w:rPr>
+        <w:t xml:space="preserve">stop. Never invent a slot. A plausible-sounding time that turns out to be</w:t>
+      </w:r>
+    </w:p>
+    <w:p>
+      <w:pPr>
+        <w:shd w:fill="F2F5F8" w:color="auto" w:val="clear"/>
+        <w:spacing w:after="0" w:line="230"/>
+        <w:ind w:left="170" w:right="170"/>
+      </w:pPr>
+      <w:r>
+        <w:rPr>
+          <w:rFonts w:ascii="Consolas" w:cs="Consolas" w:eastAsia="Consolas" w:hAnsi="Consolas"/>
+          <w:sz w:val="17"/>
+          <w:szCs w:val="17"/>
+        </w:rPr>
+        <w:t xml:space="preserve">taken is worse than asking, because the client turns up to a full room.</w:t>
       </w:r>
     </w:p>
     <w:p>

</xml_diff>